<commit_message>
docs: actualiza borrador y programa de control del QD001
</commit_message>
<xml_diff>
--- a/output/informe-borrador-corregido/Informe_Robotica_Educativa_borrador.docx
+++ b/output/informe-borrador-corregido/Informe_Robotica_Educativa_borrador.docx
@@ -60,7 +60,7 @@
           <w:b w:val="1"/>
           <w:sz w:val="28"/>
         </w:rPr>
-        <w:t>Robótica educativa y estadística: propuesta de programación en Python y evaluación del desempeño de un robot</w:t>
+        <w:t xml:space="preserve">Robótica educativa y estadística: análisis y evaluación del robot ACEBOTT QD001</w:t>
       </w:r>
     </w:p>
     <w:p>
@@ -400,7 +400,7 @@
             <w:color w:val="000000"/>
             <w:sz w:val="24"/>
           </w:rPr>
-          <w:t>5.2 MicroPython para ESP32</w:t>
+          <w:t>5.2 Control del ESP32 mediante ACECode</w:t>
         </w:r>
       </w:hyperlink>
       <w:r>
@@ -474,7 +474,7 @@
       </w:hyperlink>
       <w:r>
         <w:tab/>
-        <w:t>7</w:t>
+        <w:t>6</w:t>
       </w:r>
     </w:p>
     <w:p>
@@ -520,7 +520,7 @@
       </w:hyperlink>
       <w:r>
         <w:tab/>
-        <w:t>8</w:t>
+        <w:t>7</w:t>
       </w:r>
     </w:p>
     <w:p>
@@ -630,7 +630,7 @@
             <w:color w:val="000000"/>
             <w:sz w:val="24"/>
           </w:rPr>
-          <w:t>6.3 Experiencia de armado</w:t>
+          <w:t>6.3 Experiencia de armado y puesta en marcha</w:t>
         </w:r>
       </w:hyperlink>
       <w:r>
@@ -653,7 +653,7 @@
             <w:color w:val="000000"/>
             <w:sz w:val="24"/>
           </w:rPr>
-          <w:t>6.4 Programa en Python</w:t>
+          <w:t>6.4 Programa de control</w:t>
         </w:r>
       </w:hyperlink>
       <w:r>
@@ -865,7 +865,7 @@
       </w:hyperlink>
       <w:r>
         <w:tab/>
-        <w:t>19</w:t>
+        <w:t>20</w:t>
       </w:r>
     </w:p>
     <w:p>
@@ -888,7 +888,7 @@
       </w:hyperlink>
       <w:r>
         <w:tab/>
-        <w:t>23</w:t>
+        <w:t>24</w:t>
       </w:r>
     </w:p>
     <w:p>
@@ -911,7 +911,7 @@
       </w:hyperlink>
       <w:r>
         <w:tab/>
-        <w:t>23</w:t>
+        <w:t>24</w:t>
       </w:r>
     </w:p>
     <w:p>
@@ -934,7 +934,7 @@
       </w:hyperlink>
       <w:r>
         <w:tab/>
-        <w:t>25</w:t>
+        <w:t>26</w:t>
       </w:r>
     </w:p>
     <w:p>
@@ -957,7 +957,7 @@
       </w:hyperlink>
       <w:r>
         <w:tab/>
-        <w:t>26</w:t>
+        <w:t>27</w:t>
       </w:r>
     </w:p>
     <w:p>
@@ -980,7 +980,7 @@
       </w:hyperlink>
       <w:r>
         <w:tab/>
-        <w:t>27</w:t>
+        <w:t>28</w:t>
       </w:r>
     </w:p>
     <w:p>
@@ -1003,7 +1003,7 @@
       </w:hyperlink>
       <w:r>
         <w:tab/>
-        <w:t>32</w:t>
+        <w:t>33</w:t>
       </w:r>
     </w:p>
     <w:p>
@@ -1026,7 +1026,7 @@
       </w:hyperlink>
       <w:r>
         <w:tab/>
-        <w:t>33</w:t>
+        <w:t>34</w:t>
       </w:r>
     </w:p>
     <w:p>
@@ -1081,7 +1081,7 @@
           <w:rFonts w:ascii="Arial" w:hAnsi="Arial" w:eastAsia="Arial" w:cs="Arial"/>
           <w:sz w:val="24"/>
         </w:rPr>
-        <w:t>Este trabajo aborda la robótica desde Probabilidad y Estadística. Las lecturas de un sensor pueden variar aun cuando se repita una medición en condiciones semejantes. Además, una orden de movimiento y su resultado físico dependen del montaje, la alimentación y las condiciones del ensayo. Para evaluar el desempeño del robot se necesitan observaciones repetidas y criterios explícitos de comparación. El tema se eligió para vincular Python con un dispositivo físico, producir datos propios y evaluar su confiabilidad con evidencia.</w:t>
+        <w:t>Este trabajo aborda la robótica desde Probabilidad y Estadística. Las lecturas de un sensor pueden variar aun cuando se repita una medición en condiciones semejantes. Además, una orden de movimiento y su resultado físico dependen del montaje, la alimentación y las condiciones del ensayo. Para evaluar el desempeño del robot se necesitan observaciones repetidas y criterios explícitos de comparación. El tema se eligió para vincular la programación con un dispositivo físico, producir datos propios y evaluar su confiabilidad con evidencia.</w:t>
       </w:r>
     </w:p>
     <w:p>
@@ -1109,7 +1109,7 @@
           <w:rFonts w:ascii="Arial" w:hAnsi="Arial" w:eastAsia="Arial" w:cs="Arial"/>
           <w:sz w:val="24"/>
         </w:rPr>
-        <w:t>La próxima etapa consiste en programar el desplazamiento automático y la detención ante obstáculos con MicroPython en el ESP32. La implementación autónoma y la toma de mediciones están pendientes.</w:t>
+        <w:t xml:space="preserve">El robot utiliza el programa de control del QD001 V2.0, cargado mediante ACECode. Este trabajo explica cómo relaciona sensores y actuadores y propone ensayos estadísticos del modo de evasión de obstáculos. La comprobación de ese modo y la obtención de datos experimentales están pendientes.</w:t>
       </w:r>
     </w:p>
     <w:p>
@@ -1123,7 +1123,7 @@
           <w:rFonts w:ascii="Arial" w:hAnsi="Arial" w:eastAsia="Arial" w:cs="Arial"/>
           <w:sz w:val="24"/>
         </w:rPr>
-        <w:t>El informe presenta el problema, los objetivos y los fundamentos teóricos; describe el prototipo y la experiencia de armado; y propone una metodología para estudiar la precisión de las lecturas y la confiabilidad del frenado.</w:t>
+        <w:t xml:space="preserve">El informe presenta el problema, los objetivos y los fundamentos teóricos; describe el prototipo, el armado y el programa de control; y propone una metodología para estudiar la distancia de detención y la frecuencia de evasión sin contacto.</w:t>
       </w:r>
     </w:p>
     <w:p>
@@ -1171,7 +1171,7 @@
           <w:rFonts w:ascii="Arial" w:hAnsi="Arial" w:eastAsia="Arial" w:cs="Arial"/>
           <w:sz w:val="24"/>
         </w:rPr>
-        <w:t>La respuesta del vehículo al control manual por Wi-Fi constituye el punto de partida del trabajo. Para estudiar la exactitud del sensor y la confiabilidad de una detención automática se realizarán mediciones de referencia y ensayos repetidos.</w:t>
+        <w:t xml:space="preserve">La respuesta del vehículo al control manual por Wi-Fi constituye el punto de partida del trabajo. Para estudiar con qué regularidad el programa de control detecta y evita un obstáculo se realizarán mediciones de referencia y ensayos repetidos.</w:t>
       </w:r>
     </w:p>
     <w:p>
@@ -1186,7 +1186,7 @@
           <w:b w:val="0"/>
           <w:sz w:val="24"/>
         </w:rPr>
-        <w:t>La pregunta de investigación es: ¿con qué error mide distancias el sensor instalado y con qué frecuencia el robot logra detenerse sin colisionar, bajo condiciones previamente definidas, una vez implementado el control autónomo?</w:t>
+        <w:t xml:space="preserve">La pregunta de investigación es: ¿a qué distancia de un obstáculo se detiene el robot en el modo de evasión del programa de control, cuánto varía esa distancia entre repeticiones y con qué frecuencia logra evitar el obstáculo sin colisionar, bajo condiciones previamente definidas?</w:t>
       </w:r>
     </w:p>
     <w:p>
@@ -1218,7 +1218,7 @@
           <w:b w:val="0"/>
           <w:sz w:val="24"/>
         </w:rPr>
-        <w:t>Desarrollar un programa de movimiento autónomo y detención ante obstáculos para el ACEBOTT QD001 y evaluar estadísticamente su desempeño mediante datos obtenidos por el grupo.</w:t>
+        <w:t xml:space="preserve">Explicar el funcionamiento del programa de control del ACEBOTT QD001 en el modo de evasión de obstáculos y evaluar estadísticamente su desempeño mediante datos obtenidos por el grupo.</w:t>
       </w:r>
     </w:p>
     <w:p>
@@ -1265,7 +1265,7 @@
           <w:b w:val="0"/>
           <w:sz w:val="24"/>
         </w:rPr>
-        <w:t>2. Implementar el algoritmo de lectura, validación, decisión, actuación y registro, utilizando la tecnología de Python que resulte compatible con el equipo.</w:t>
+        <w:t xml:space="preserve">2. Describir el funcionamiento del programa de control: la lectura del sensor ultrasónico, la decisión y la acción sobre los motores.</w:t>
       </w:r>
     </w:p>
     <w:p>
@@ -1280,7 +1280,7 @@
           <w:b w:val="0"/>
           <w:sz w:val="24"/>
         </w:rPr>
-        <w:t>3. Establecer y ejecutar un protocolo de repetibilidad, calibración y frenado, con criterios de éxito definidos antes de medir.</w:t>
+        <w:t xml:space="preserve">3. Establecer y ejecutar un protocolo de ensayos de distancia de detención y de evasión, con criterios de éxito definidos antes de medir.</w:t>
       </w:r>
     </w:p>
     <w:p>
@@ -1310,7 +1310,7 @@
           <w:b w:val="0"/>
           <w:sz w:val="24"/>
         </w:rPr>
-        <w:t>5. Interpretar los resultados, reconocer limitaciones y fundamentar mejoras del programa o del procedimiento.</w:t>
+        <w:t xml:space="preserve">5. Interpretar los resultados, reconocer limitaciones y fundamentar mejoras del procedimiento o del uso del robot.</w:t>
       </w:r>
     </w:p>
     <w:p>
@@ -1324,7 +1324,7 @@
           <w:rFonts w:ascii="Arial" w:hAnsi="Arial" w:eastAsia="Arial" w:cs="Arial"/>
           <w:sz w:val="24"/>
         </w:rPr>
-        <w:t>Los objetivos orientan las etapas de programación, experimentación y análisis del proyecto.</w:t>
+        <w:t xml:space="preserve">Los objetivos orientan las etapas de análisis del programa, experimentación y análisis estadístico del proyecto.</w:t>
       </w:r>
     </w:p>
     <w:p>
@@ -1402,7 +1402,7 @@
           <w:sz w:val="28"/>
           <w:b w:val="1"/>
         </w:rPr>
-        <w:t>5.2 MicroPython para ESP32</w:t>
+        <w:t xml:space="preserve">5.2 Control del ESP32 mediante ACECode</w:t>
       </w:r>
       <w:bookmarkEnd w:id="8"/>
     </w:p>
@@ -1417,7 +1417,7 @@
           <w:rFonts w:ascii="Arial" w:hAnsi="Arial" w:eastAsia="Arial" w:cs="Arial"/>
           <w:sz w:val="24"/>
         </w:rPr>
-        <w:t>Python es un lenguaje interpretado de alto nivel. MicroPython es una implementación de Python orientada a microcontroladores, con un puerto específico para la familia ESP32. El programa se ejecuta en la placa y permite que el dispositivo tome decisiones de movimiento sin recibirlas continuamente desde una computadora (MicroPython, s. f.-a).</w:t>
+        <w:t xml:space="preserve">El ESP32 ejecuta el programa que coordina los sensores y actuadores. ACECode permite seleccionar el equipo, cargar su firmware y transferir un proyecto de control. El material consultado ofrece proyectos para ESP32 configurados en el modo Arduino, junto con ejemplos de código Arduino/C++ (ACEBOTT, s. f.-k; s. f.-l).</w:t>
       </w:r>
     </w:p>
     <w:p>
@@ -1432,7 +1432,7 @@
           <w:b w:val="0"/>
           <w:sz w:val="24"/>
         </w:rPr>
-        <w:t>El módulo machine proporciona acceso al hardware. Pin permite configurar entradas y salidas digitales; PWM genera señales con un ciclo de trabajo configurable; y time_pulse_us mide la duración de un pulso en microsegundos y admite un tiempo máximo de espera. Sus resultados de error o de espera agotada deben tratarse como lecturas inválidas (MicroPython, s. f.-b).</w:t>
+        <w:t xml:space="preserve">El programa se ejecuta en la placa sin una computadora conectada. Según el modo seleccionado, procesa las órdenes del celular o las entradas de los sensores y envía instrucciones a motores, luces y zumbador. La Car Shield realiza el control de potencia de los motores.</w:t>
       </w:r>
     </w:p>
     <w:p>
@@ -1446,7 +1446,7 @@
           <w:rFonts w:ascii="Arial" w:hAnsi="Arial" w:eastAsia="Arial" w:cs="Arial"/>
           <w:sz w:val="24"/>
         </w:rPr>
-        <w:t>En este proyecto se utilizará MicroPython en el ESP32. Su instalación y las pruebas del programa corresponden a la próxima etapa, en la que se definirán los pines y las bibliotecas necesarios para el montaje.</w:t>
+        <w:t xml:space="preserve">Se analizará el proyecto de control 4.4.2APPControlCar2 para el QD001 V2.0 y se relacionarán sus instrucciones con el comportamiento observado. La descripción del algoritmo se distinguirá de la comprobación experimental de cada función.</w:t>
       </w:r>
     </w:p>
     <w:p>
@@ -2068,7 +2068,7 @@
           <w:b w:val="0"/>
           <w:sz w:val="24"/>
         </w:rPr>
-        <w:t>La frecuencia de éxito k/n estima la probabilidad de frenado correcto. Si hay n intentos independientes, dos resultados posibles y una probabilidad p constante entre 0 y 1, la cantidad de éxitos X, de 0 a n, puede modelarse mediante una binomial (NIST, s. f.-b):</w:t>
+        <w:t>La frecuencia de éxito k/n estima la probabilidad de evasión correcta. Si hay n intentos independientes, dos resultados posibles y una probabilidad p constante entre 0 y 1, la cantidad de éxitos X, de 0 a n, puede modelarse mediante una binomial (NIST, s. f.-b):</w:t>
       </w:r>
     </w:p>
     <w:p>
@@ -2626,7 +2626,7 @@
           <w:rFonts w:ascii="Arial" w:hAnsi="Arial" w:eastAsia="Arial" w:cs="Arial"/>
           <w:sz w:val="24"/>
         </w:rPr>
-        <w:t>El grupo completó el armado, instaló el sensor ultrasónico y verificó desplazamientos mediante la aplicación oficial por Wi-Fi. La tarea autónoma pendiente consiste en avanzar y detenerse cuando un obstáculo se encuentre dentro de un umbral de seguridad.</w:t>
+        <w:t xml:space="preserve">El programa de control ofrece movimiento manual desde la aplicación, luces, melodías, evasión de obstáculos, seguimiento de objetos y dos modalidades de seguimiento de línea. El trabajo se concentra en estudiar la evasión con el sensor ultrasónico. Sus ensayos están pendientes.</w:t>
       </w:r>
     </w:p>
     <w:p>
@@ -2990,7 +2990,7 @@
           <w:sz w:val="28"/>
           <w:b w:val="1"/>
         </w:rPr>
-        <w:t>6.3 Experiencia de armado</w:t>
+        <w:t xml:space="preserve">6.3 Experiencia de armado y puesta en marcha</w:t>
       </w:r>
       <w:bookmarkEnd w:id="18"/>
     </w:p>
@@ -3029,7 +3029,7 @@
           <w:rFonts w:ascii="Arial" w:hAnsi="Arial" w:eastAsia="Arial" w:cs="Arial"/>
           <w:sz w:val="24"/>
         </w:rPr>
-        <w:t>Con el prototipo ensamblado, se conectó la aplicación oficial de ACEBOTT por Wi-Fi y el vehículo respondió correctamente a las órdenes manuales de movimiento.</w:t>
+        <w:t>Con el prototipo ensamblado, se comprobó el movimiento mediante la aplicación oficial de ACEBOTT por Wi-Fi. Tras las dificultades de conexión registradas el 23 de octubre, se recuperó el control en modo punto de acceso (AP). El 27 de octubre de 2026 el robot funcionó hasta agotarse las baterías. El anexo A conserva el registro de las sesiones.</w:t>
       </w:r>
     </w:p>
     <w:p>
@@ -3045,7 +3045,7 @@
           <w:sz w:val="28"/>
           <w:b w:val="1"/>
         </w:rPr>
-        <w:t>6.4 Programa en Python</w:t>
+        <w:t xml:space="preserve">6.4 Programa de control</w:t>
       </w:r>
       <w:bookmarkEnd w:id="19"/>
     </w:p>
@@ -3060,7 +3060,7 @@
           <w:rFonts w:ascii="Arial" w:hAnsi="Arial" w:eastAsia="Arial" w:cs="Arial"/>
           <w:sz w:val="24"/>
         </w:rPr>
-        <w:t>El programa autónomo está pendiente de implementación. Se utilizará MicroPython en el ESP32. Antes de cargarlo se guardará el firmware de fábrica para poder volver a usar la aplicación.</w:t>
+        <w:t xml:space="preserve">Se utiliza el proyecto 4.4.2APPControlCar2 del QD001 V2.0, cargado desde ACECode. El ESP32 crea una red Wi-Fi propia en modo AP; el celular se conecta a ella y la aplicación envía las órdenes de control (ACEBOTT, s. f.-k; s. f.-l).</w:t>
       </w:r>
     </w:p>
     <w:p>
@@ -3074,7 +3074,7 @@
           <w:rFonts w:ascii="Arial" w:hAnsi="Arial" w:eastAsia="Arial" w:cs="Arial"/>
           <w:sz w:val="24"/>
         </w:rPr>
-        <w:t>El ciclo del programa comprenderá leer el sensor, validar la lectura y su antigüedad, decidir el estado del movimiento, actuar sobre la tracción y registrar el evento. Ante un obstáculo próximo, una lectura inválida, un error o una espera agotada se ordenará la detención. También se incorporará una acción de parada manual.</w:t>
+        <w:t xml:space="preserve">El programa selecciona el modo activo, procesa las entradas correspondientes y envía órdenes de dirección y velocidad a la Car Shield. Incluye movimiento manual, luces, melodías, seguimiento de objetos, evasión y seguimiento de línea. El paquete contiene ejemplos separados para el mando infrarrojo.</w:t>
       </w:r>
     </w:p>
     <w:p>
@@ -3088,7 +3088,7 @@
           <w:rFonts w:ascii="Arial" w:hAnsi="Arial" w:eastAsia="Arial" w:cs="Arial"/>
           <w:sz w:val="24"/>
         </w:rPr>
-        <w:t>Los GPIO, el umbral de detención y los valores PWM se definirán a partir del montaje y se comprobarán durante las pruebas.</w:t>
+        <w:t xml:space="preserve">En la rutina de evasión del proyecto de referencia se compara la lectura frontal con un umbral nominal de 25 cm. Si la lectura es menor o igual, se ordena parar, se orienta el sensor hacia ambos lados y se comparan esas distancias para decidir el retroceso y el giro. Con una lectura frontal mayor, se ordena avanzar. El umbral del código no equivale a una distancia física de detención medida.</w:t>
       </w:r>
     </w:p>
     <w:p>
@@ -3102,7 +3102,7 @@
           <w:rFonts w:ascii="Arial" w:hAnsi="Arial" w:eastAsia="Arial" w:cs="Arial"/>
           <w:sz w:val="24"/>
         </w:rPr>
-        <w:t>Las lecturas y los eventos de los ensayos se guardarán en archivos CSV mediante una conexión con la computadora. El registro distinguirá las mediciones del sensor, las referencias obtenidas con instrumentos externos y las observaciones manuales. El código, su versión y sus parámetros se incorporarán al anexo A. Para el análisis se consideran las bibliotecas statistics, pandas y matplotlib.</w:t>
+        <w:t xml:space="preserve">Los ensayos registrarán la primera detención previa a la maniobra y el resultado de la evasión. Las distancias se medirán con cinta métrica y video; las observaciones y el análisis se conservarán en una planilla de cálculo.</w:t>
       </w:r>
     </w:p>
     <w:p>
@@ -3133,7 +3133,7 @@
           <w:rFonts w:ascii="Arial" w:hAnsi="Arial" w:eastAsia="Arial" w:cs="Arial"/>
           <w:sz w:val="24"/>
         </w:rPr>
-        <w:t>La metodología está pendiente de ejecución y comprende tres ensayos prioritarios: repetibilidad, calibración y frenado. Como actividad opcional se estudiará la velocidad según PWM mediante un recorrido de 1 m, con registro del tiempo y del valor PWM utilizado.</w:t>
+        <w:t xml:space="preserve">La metodología está pendiente de ejecución. Antes de medir se comprobará el modo de evasión. Se proponen dos ensayos prioritarios, distancia de detención y evasión, y una calibración complementaria del sensor si es posible obtener sus lecturas.</w:t>
       </w:r>
     </w:p>
     <w:p>
@@ -3256,7 +3256,7 @@
                 <w:b w:val="0"/>
                 <w:sz w:val="24"/>
               </w:rPr>
-              <w:t>Repetibilidad</w:t>
+              <w:t xml:space="preserve">Distancia de detención</w:t>
             </w:r>
           </w:p>
         </w:tc>
@@ -3282,7 +3282,7 @@
                 <w:b w:val="0"/>
                 <w:sz w:val="24"/>
               </w:rPr>
-              <w:t>Una lectura válida a una distancia fija. Se conservará también el registro de los intentos inválidos.</w:t>
+              <w:t xml:space="preserve">Una corrida: separación entre el frente del robot y el obstáculo en la primera detención previa a la maniobra, medida con cinta métrica y video.</w:t>
             </w:r>
           </w:p>
         </w:tc>
@@ -3313,7 +3313,7 @@
                 <w:b w:val="0"/>
                 <w:sz w:val="24"/>
               </w:rPr>
-              <w:t>Calibración</w:t>
+              <w:t xml:space="preserve">Calibración (complementario)</w:t>
             </w:r>
           </w:p>
         </w:tc>
@@ -3370,7 +3370,7 @@
                 <w:b w:val="0"/>
                 <w:sz w:val="24"/>
               </w:rPr>
-              <w:t>Frenado</w:t>
+              <w:t xml:space="preserve">Evasión</w:t>
             </w:r>
           </w:p>
         </w:tc>
@@ -3396,7 +3396,7 @@
                 <w:b w:val="0"/>
                 <w:sz w:val="24"/>
               </w:rPr>
-              <w:t>Una corrida completa con condición inicial, resultado, distancia final y causa de finalización.</w:t>
+              <w:t xml:space="preserve">Una corrida completa: si el robot evitó el obstáculo sin contacto, causa de finalización y observaciones.</w:t>
             </w:r>
           </w:p>
         </w:tc>
@@ -3429,7 +3429,7 @@
           <w:b w:val="0"/>
           <w:sz w:val="24"/>
         </w:rPr>
-        <w:t>Antes de medir se identificarán el instrumento de referencia y su resolución, el punto físico desde el que se mide, la superficie, el obstáculo, la temperatura ambiente y el estado de alimentación. Se registrarán la versión del programa, los parámetros y el método de obtención de cada variable. Se mantendrán comparables las condiciones de cada serie.</w:t>
+        <w:t>Antes de medir se identificarán el instrumento de referencia y su resolución, el punto físico desde el que se mide, la superficie, el obstáculo, la temperatura ambiente y el estado de alimentación. Se registrarán el programa cargado, el modo utilizado y el método de obtención de cada variable. Se mantendrán comparables las condiciones de cada serie.</w:t>
       </w:r>
     </w:p>
     <w:p>
@@ -3444,7 +3444,7 @@
           <w:b w:val="0"/>
           <w:sz w:val="24"/>
         </w:rPr>
-        <w:t>Repetibilidad. Se elegirán tres distancias de referencia dentro del rango confirmado del módulo. Como meta inicial se proponen 30 lecturas por distancia; el número definitivo se establecerá antes del ensayo. El objeto y el sensor permanecerán fijos durante cada serie. Se informarán el número de intentos, las lecturas válidas y los fallos por separado.</w:t>
+        <w:t xml:space="preserve">Distancia de detención. Se mantendrán la posición inicial y el obstáculo. Se medirá, con cinta métrica y video, la separación entre el frente del robot y el obstáculo en la primera detención previa a la maniobra. Un giro o una distancia final no se mezclarán con esa medición. Si no se identifica la detención, se registrará como dato ausente con su motivo. Se proponen inicialmente 30 corridas por serie; la cantidad se fijará antes de medir.</w:t>
       </w:r>
     </w:p>
     <w:p>
@@ -3459,7 +3459,7 @@
           <w:b w:val="0"/>
           <w:sz w:val="24"/>
         </w:rPr>
-        <w:t>Calibración. Se elegirán entre ocho y diez distancias de referencia y varias repeticiones por distancia. El punto de referencia y las unidades serán constantes. Se registrarán los pares originales, el sesgo, el MAE y los residuos del ajuste. Si se aplica una corrección, se la evaluará con datos adicionales y se conservarán las lecturas anteriores a ella.</w:t>
+        <w:t xml:space="preserve">Calibración (complementario). Requiere visualizar las lecturas del sensor y se realizará si los ejemplos del fabricante en ACECode lo permiten. Se elegirán entre ocho y diez distancias de referencia, con varias repeticiones por distancia, y se compararán las lecturas con la cinta métrica mediante el sesgo, el MAE y la regresión lineal.</w:t>
       </w:r>
     </w:p>
     <w:p>
@@ -3474,7 +3474,7 @@
           <w:b w:val="0"/>
           <w:sz w:val="24"/>
         </w:rPr>
-        <w:t>Frenado. Cada corrida comenzará en una posición definida, con el mismo obstáculo y una configuración de movimiento registrada. Antes de iniciar la serie se fijarán el umbral de detención y una banda aceptable para la distancia final, compatible con la seguridad y la resolución del instrumento de referencia.</w:t>
+        <w:t xml:space="preserve">Evasión. En las mismas corridas se registrará si el robot evitó el obstáculo. Antes de iniciar la serie se fijarán el criterio de éxito y las condiciones de la corrida: posición inicial, obstáculo, superficie y carga de las baterías.</w:t>
       </w:r>
     </w:p>
     <w:p>
@@ -3489,7 +3489,7 @@
           <w:b w:val="0"/>
           <w:sz w:val="24"/>
         </w:rPr>
-        <w:t>El éxito propuesto requiere detenerse sin contacto con el obstáculo y dentro de esa banda. Se registrarán también colisiones, detenciones fuera de la banda, fallos de lectura e interrupciones manuales. Ningún intento se excluirá silenciosamente: su clasificación y su motivo permanecerán en el registro. La regla de análisis se cerrará antes de conocer los resultados.</w:t>
+        <w:t xml:space="preserve">El éxito requiere completar la evasión sin contacto ni intervención manual. Antes de medir se definirán la finalización y el tiempo máximo de cada corrida. Se registrarán colisiones, fallos e interrupciones, sin excluir intentos silenciosamente. La regla de clasificación se fijará antes de conocer los resultados.</w:t>
       </w:r>
     </w:p>
     <w:p>
@@ -3504,7 +3504,7 @@
           <w:b w:val="0"/>
           <w:sz w:val="24"/>
         </w:rPr>
-        <w:t>Los ensayos se analizarán por condición. Una aplicación de la binomial requerirá justificar independencia aproximada y probabilidad de éxito comparable; un cambio de velocidad, obstáculo o montaje exigirá identificar una serie distinta. No se reemplazarán datos ausentes por cero ni se mezclará una lectura individual con un promedio de varias lecturas.</w:t>
+        <w:t>Los ensayos se analizarán por condición. Una aplicación de la binomial requerirá justificar independencia aproximada y probabilidad de éxito comparable; un cambio de velocidad, obstáculo o montaje exigirá identificar una serie distinta. No se reemplazarán datos ausentes por cero.</w:t>
       </w:r>
     </w:p>
     <w:p>
@@ -3535,7 +3535,7 @@
           <w:rFonts w:ascii="Arial" w:hAnsi="Arial" w:eastAsia="Arial" w:cs="Arial"/>
           <w:sz w:val="24"/>
         </w:rPr>
-        <w:t>El prototipo permite relacionar la programación con acciones físicas y estudiar la variación de las lecturas de un sensor. Los ensayos requieren identificar el circuito integrado de potencia, comprobar las conexiones y registrar las condiciones de alimentación.</w:t>
+        <w:t xml:space="preserve">El prototipo permite relacionar el programa con el comportamiento ante un obstáculo. Se estudiarán sus parámetros y la variación entre corridas mediante observación directa. Se registrará el estado de las baterías, que se agotaron durante la sesión del 27 de octubre. La identificación del circuito integrado de potencia sigue pendiente.</w:t>
       </w:r>
     </w:p>
     <w:p>
@@ -3550,21 +3550,7 @@
           <w:b w:val="0"/>
           <w:sz w:val="24"/>
         </w:rPr>
-        <w:t>Antes de intervenir el cableado se desconectará la alimentación. Se comprobarán la polaridad, la compatibilidad de niveles eléctricos y las protecciones existentes, utilizando documentación de la revisión correcta del equipo. Los motores se controlarán mediante la etapa de potencia prevista para el montaje.</w:t>
-      </w:r>
-    </w:p>
-    <w:p>
-      <w:pPr>
-        <w:keepNext w:val="0"/>
-        <w:pageBreakBefore w:val="0"/>
-        <w:spacing w:after="120" w:before="0"/>
-      </w:pPr>
-      <w:r>
-        <w:rPr>
-          <w:rFonts w:ascii="Arial" w:hAnsi="Arial" w:eastAsia="Arial" w:cs="Arial"/>
-          <w:sz w:val="24"/>
-        </w:rPr>
-        <w:t>Las primeras pruebas de actuadores se realizarán con el chasis elevado y las ruedas libres. Las pruebas en piso se harán a baja velocidad, en una zona despejada y con parada manual disponible. Se comprobará también la detención ante lecturas inválidas o expiradas.</w:t>
+        <w:t xml:space="preserve">Antes de manipular el robot se desconectará la alimentación. Las primeras pruebas se harán con las ruedas libres; las corridas en piso, a baja velocidad, en una zona despejada y con parada manual disponible. Se registrarán las lecturas inválidas y las anomalías observadas.</w:t>
       </w:r>
     </w:p>
     <w:p>
@@ -3595,7 +3581,7 @@
           <w:rFonts w:ascii="Arial" w:hAnsi="Arial" w:eastAsia="Arial" w:cs="Arial"/>
           <w:sz w:val="24"/>
         </w:rPr>
-        <w:t>El grupo completó el armado y comprobó la respuesta del vehículo a órdenes manuales desde la aplicación oficial por Wi-Fi. Los ensayos de distancia y frenado autónomo, sus resultados y el análisis estadístico están pendientes. Las tablas siguientes se utilizarán para registrar los datos; sus casillas vacías representan información por completar.</w:t>
+        <w:t>El grupo completó el armado y comprobó la respuesta del vehículo a órdenes manuales desde la aplicación oficial por Wi-Fi. Los ensayos de distancia de detención y evasión, sus resultados y el análisis estadístico están pendientes. Las tablas siguientes se utilizarán para registrar los datos; sus casillas vacías representan información por completar.</w:t>
       </w:r>
     </w:p>
     <w:p>
@@ -3610,7 +3596,7 @@
           <w:b/>
           <w:sz w:val="24"/>
         </w:rPr>
-        <w:t>Tabla 3. Resumen de repetibilidad por completar.</w:t>
+        <w:t xml:space="preserve">Tabla 3. Resumen de la distancia de detención por completar.</w:t>
       </w:r>
     </w:p>
     <w:tbl>
@@ -3802,7 +3788,7 @@
                 <w:b w:val="0"/>
                 <w:sz w:val="24"/>
               </w:rPr>
-              <w:t>Distancia 1</w:t>
+              <w:t xml:space="preserve">Serie 1</w:t>
             </w:r>
           </w:p>
         </w:tc>
@@ -3933,7 +3919,7 @@
                 <w:b w:val="0"/>
                 <w:sz w:val="24"/>
               </w:rPr>
-              <w:t>Distancia 2</w:t>
+              <w:t xml:space="preserve">Serie 2</w:t>
             </w:r>
           </w:p>
         </w:tc>
@@ -4064,7 +4050,7 @@
                 <w:b w:val="0"/>
                 <w:sz w:val="24"/>
               </w:rPr>
-              <w:t>Distancia 3</w:t>
+              <w:t xml:space="preserve">Serie 3</w:t>
             </w:r>
           </w:p>
         </w:tc>
@@ -4197,7 +4183,7 @@
           <w:b w:val="0"/>
           <w:sz w:val="24"/>
         </w:rPr>
-        <w:t>Cada condición deberá indicar su distancia de referencia, el número de fallos, el sesgo y el intervalo de confianza de la media, con sus supuestos. Se incorporará un histograma por condición cuando existan suficientes observaciones.</w:t>
+        <w:t xml:space="preserve">Cada serie deberá indicar sus condiciones (obstáculo, superficie y carga de las baterías), el número de fallos y el intervalo de confianza de la media, con sus supuestos. Se incorporará un histograma por serie cuando existan suficientes observaciones.</w:t>
       </w:r>
     </w:p>
     <w:p>
@@ -4212,7 +4198,7 @@
           <w:b/>
           <w:sz w:val="24"/>
         </w:rPr>
-        <w:t>Tabla 4. Resumen de frenado por completar.</w:t>
+        <w:t xml:space="preserve">Tabla 4. Resumen de evasión por completar.</w:t>
       </w:r>
     </w:p>
     <w:tbl>
@@ -4376,7 +4362,7 @@
                 <w:b w:val="0"/>
                 <w:sz w:val="24"/>
               </w:rPr>
-              <w:t>Serie de frenado 1</w:t>
+              <w:t xml:space="preserve">Serie de evasión 1</w:t>
             </w:r>
           </w:p>
         </w:tc>
@@ -4482,7 +4468,7 @@
                 <w:b w:val="0"/>
                 <w:sz w:val="24"/>
               </w:rPr>
-              <w:t>Serie de frenado 2</w:t>
+              <w:t xml:space="preserve">Serie de evasión 2</w:t>
             </w:r>
           </w:p>
         </w:tc>
@@ -4590,7 +4576,7 @@
           <w:b w:val="0"/>
           <w:sz w:val="24"/>
         </w:rPr>
-        <w:t>Para la calibración se incorporarán los pares originales, un gráfico de dispersión con la recta ajustada y la relación ideal, la ecuación, r, el MAE y un gráfico de errores o residuos. La interpretación deberá identificar el rango medido y las limitaciones del instrumento de referencia.</w:t>
+        <w:t>Si se realiza la calibración complementaria, se incorporarán los pares originales, un gráfico de dispersión con la recta ajustada y la relación ideal, la ecuación, r, el MAE y un gráfico de errores o residuos. La interpretación deberá identificar el rango medido y las limitaciones del instrumento de referencia.</w:t>
       </w:r>
     </w:p>
     <w:p>
@@ -4604,7 +4590,7 @@
           <w:rFonts w:ascii="Arial" w:hAnsi="Arial" w:eastAsia="Arial" w:cs="Arial"/>
           <w:sz w:val="24"/>
         </w:rPr>
-        <w:t>El análisis permitirá estudiar el sesgo, la dispersión de las lecturas y la frecuencia con que se cumple el criterio de frenado. Las comparaciones con los antecedentes y las cifras del fabricante considerarán las magnitudes, los modelos y las condiciones de cada estudio.</w:t>
+        <w:t>El análisis permitirá estudiar la distancia media de detención, su dispersión y la frecuencia con que el robot evita el obstáculo. Las comparaciones con los antecedentes y las cifras del fabricante considerarán las magnitudes, los modelos y las condiciones de cada estudio.</w:t>
       </w:r>
     </w:p>
     <w:p>
@@ -4649,7 +4635,7 @@
           <w:rFonts w:ascii="Arial" w:hAnsi="Arial" w:eastAsia="Arial" w:cs="Arial"/>
           <w:sz w:val="24"/>
         </w:rPr>
-        <w:t>La conclusión experimental está pendiente de los ensayos. Se elaborará a partir de la implementación del programa autónomo y de los datos de repetibilidad, calibración y frenado.</w:t>
+        <w:t>La conclusión experimental está pendiente de los ensayos. Se elaborará a partir del análisis del programa de control y de los datos de distancia de detención y evasión.</w:t>
       </w:r>
     </w:p>
     <w:p>
@@ -4663,7 +4649,7 @@
           <w:rFonts w:ascii="Arial" w:hAnsi="Arial" w:eastAsia="Arial" w:cs="Arial"/>
           <w:sz w:val="24"/>
         </w:rPr>
-        <w:t>El análisis permitirá responder la pregunta de investigación, evaluar los objetivos y fundamentar las mejoras del programa o del procedimiento.</w:t>
+        <w:t>El análisis permitirá responder la pregunta de investigación, evaluar los objetivos y fundamentar las mejoras del procedimiento o del uso del robot.</w:t>
       </w:r>
     </w:p>
     <w:p>
@@ -4930,66 +4916,6 @@
           <w:rFonts w:ascii="Arial" w:hAnsi="Arial" w:eastAsia="Arial" w:cs="Arial"/>
           <w:sz w:val="24"/>
         </w:rPr>
-        <w:t>MicroPython. (s. f.-a). Quick reference for the ESP32. Documentación de la rama latest; se consultará la versión del firmware utilizado.</w:t>
-      </w:r>
-    </w:p>
-    <w:p>
-      <w:pPr>
-        <w:spacing w:after="180"/>
-        <w:jc w:val="left"/>
-      </w:pPr>
-      <w:hyperlink r:id="rId17">
-        <w:r>
-          <w:rPr>
-            <w:rFonts w:ascii="Arial" w:hAnsi="Arial" w:eastAsia="Arial" w:cs="Arial"/>
-            <w:sz w:val="24"/>
-            <w:color w:val="1F4E79"/>
-            <w:u w:val="single"/>
-          </w:rPr>
-          <w:t>https://docs.micropython.org/en/latest/esp32/quickref.html</w:t>
-        </w:r>
-      </w:hyperlink>
-    </w:p>
-    <w:p>
-      <w:pPr>
-        <w:keepNext/>
-        <w:spacing w:after="0"/>
-      </w:pPr>
-      <w:r>
-        <w:rPr>
-          <w:rFonts w:ascii="Arial" w:hAnsi="Arial" w:eastAsia="Arial" w:cs="Arial"/>
-          <w:sz w:val="24"/>
-        </w:rPr>
-        <w:t>MicroPython. (s. f.-b). machine - functions related to the hardware. Apartado machine.time_pulse_us y clases del módulo.</w:t>
-      </w:r>
-    </w:p>
-    <w:p>
-      <w:pPr>
-        <w:spacing w:after="180"/>
-        <w:jc w:val="left"/>
-      </w:pPr>
-      <w:hyperlink r:id="rId18">
-        <w:r>
-          <w:rPr>
-            <w:rFonts w:ascii="Arial" w:hAnsi="Arial" w:eastAsia="Arial" w:cs="Arial"/>
-            <w:sz w:val="24"/>
-            <w:color w:val="1F4E79"/>
-            <w:u w:val="single"/>
-          </w:rPr>
-          <w:t>https://docs.micropython.org/en/latest/library/machine.html</w:t>
-        </w:r>
-      </w:hyperlink>
-    </w:p>
-    <w:p>
-      <w:pPr>
-        <w:keepNext/>
-        <w:spacing w:after="0"/>
-      </w:pPr>
-      <w:r>
-        <w:rPr>
-          <w:rFonts w:ascii="Arial" w:hAnsi="Arial" w:eastAsia="Arial" w:cs="Arial"/>
-          <w:sz w:val="24"/>
-        </w:rPr>
         <w:t>AccuDIY. (2011). HC-SR04 Ultrasonic Range Finder Manual. Copia alojada en la Universidad de York.</w:t>
       </w:r>
     </w:p>
@@ -5431,6 +5357,36 @@
       </w:hyperlink>
     </w:p>
     <w:p>
+      <w:pPr>
+        <w:keepNext/>
+        <w:spacing w:after="0"/>
+      </w:pPr>
+      <w:r>
+        <w:rPr>
+          <w:rFonts w:ascii="Arial" w:hAnsi="Arial" w:eastAsia="Arial" w:cs="Arial"/>
+          <w:sz w:val="24"/>
+        </w:rPr>
+        <w:t xml:space="preserve">ACEBOTT. (s. f.-l). Software: ACECode y herramientas de programación.</w:t>
+      </w:r>
+    </w:p>
+    <w:p>
+      <w:pPr>
+        <w:spacing w:after="180"/>
+        <w:jc w:val="left"/>
+      </w:pPr>
+      <w:hyperlink r:id="rId47">
+        <w:r>
+          <w:rPr>
+            <w:rFonts w:ascii="Arial" w:hAnsi="Arial" w:eastAsia="Arial" w:cs="Arial"/>
+            <w:sz w:val="24"/>
+            <w:color w:val="1F4E79"/>
+            <w:u w:val="single"/>
+          </w:rPr>
+          <w:t xml:space="preserve">https://acebott.com/es/software/</w:t>
+        </w:r>
+      </w:hyperlink>
+    </w:p>
+    <w:p>
       <w:bookmarkStart w:id="25" w:name="section_25"/>
       <w:pPr>
         <w:pStyle w:val="Heading1"/>
@@ -5475,7 +5431,48 @@
           <w:rFonts w:ascii="Arial" w:hAnsi="Arial" w:eastAsia="Arial" w:cs="Arial"/>
           <w:sz w:val="24"/>
         </w:rPr>
-        <w:t>La programación está pendiente de implementación. Este anexo reunirá el código ejecutado, su versión, la versión de MicroPython, el mapa de pines y los parámetros de movimiento y lectura.</w:t>
+        <w:t xml:space="preserve">Se utilizó ACECode para cargar el firmware QD y el programa 4.4.2APPControlCar2(Final program).sb3, según el procedimiento confirmado por el grupo. La copia de referencia del paquete en español se denomina 4.4.2APPControlCar2.sb3; el tutorial rápido de grabación identifica el programa final del QD001 V2.0 (ACEBOTT, s. f.-k). Registro de sesiones:</w:t>
+      </w:r>
+    </w:p>
+    <w:p>
+      <w:r>
+        <w:rPr>
+          <w:rFonts w:ascii="Arial" w:hAnsi="Arial" w:eastAsia="Arial" w:cs="Arial"/>
+          <w:sz w:val="24"/>
+        </w:rPr>
+        <w:t xml:space="preserve">16 al 20 de octubre de 2026: armado del kit siguiendo el manual y el video oficial de ACEBOTT.</w:t>
+      </w:r>
+    </w:p>
+    <w:p>
+      <w:r>
+        <w:rPr>
+          <w:rFonts w:ascii="Arial" w:hAnsi="Arial" w:eastAsia="Arial" w:cs="Arial"/>
+          <w:sz w:val="24"/>
+        </w:rPr>
+        <w:t xml:space="preserve">20 de octubre de 2026: programa de control en modo punto de acceso; control por la aplicación comprobado.</w:t>
+      </w:r>
+    </w:p>
+    <w:p>
+      <w:r>
+        <w:rPr>
+          <w:rFonts w:ascii="Arial" w:hAnsi="Arial" w:eastAsia="Arial" w:cs="Arial"/>
+          <w:sz w:val="24"/>
+        </w:rPr>
+        <w:t xml:space="preserve">23 de octubre de 2026: se informó una dificultad de conexión y se observó un proyecto vacío en ACECode. Se consideró una posible carga incompleta desde una computadora del instituto; no se registraron su orden ni los mensajes de carga y la causa no se confirmó. Se recuperó el control al cargar el programa en modo AP.</w:t>
+      </w:r>
+    </w:p>
+    <w:p>
+      <w:r>
+        <w:rPr>
+          <w:rFonts w:ascii="Arial" w:hAnsi="Arial" w:eastAsia="Arial" w:cs="Arial"/>
+          <w:sz w:val="24"/>
+        </w:rPr>
+        <w:t xml:space="preserve">27 de octubre de 2026: se cargó el programa final mediante ACECode y se comprobó el control desde la aplicación. El robot funcionó hasta que se agotaron las baterías.</w:t>
+      </w:r>
+    </w:p>
+    <w:p>
+      <w:r>
+        <w:t>En las próximas sesiones se registrarán el programa, la fecha, la computadora utilizada, el resultado de la carga y el estado de las baterías.</w:t>
       </w:r>
     </w:p>
     <w:p>
@@ -5506,7 +5503,7 @@
           <w:rFonts w:ascii="Arial" w:hAnsi="Arial" w:eastAsia="Arial" w:cs="Arial"/>
           <w:sz w:val="24"/>
         </w:rPr>
-        <w:t>Los registros conservarán las lecturas y los intentos completos, incluidos los fallos y las exclusiones justificadas. El siguiente esquema define los campos que se utilizarán durante los ensayos, pendientes de realización.</w:t>
+        <w:t>Los registros conservarán las corridas completas, incluidos los fallos y las exclusiones justificadas. El siguiente esquema define los campos que se utilizarán durante los ensayos, pendientes de realización.</w:t>
       </w:r>
     </w:p>
     <w:p>
@@ -5654,7 +5651,7 @@
                 <w:b w:val="0"/>
                 <w:sz w:val="24"/>
               </w:rPr>
-              <w:t>Ensayo, condición, identificador de corrida o lectura, fecha y versión del programa.</w:t>
+              <w:t>Ensayo, condición, identificador de corrida o lectura, fecha y programa cargado.</w:t>
             </w:r>
           </w:p>
         </w:tc>
@@ -5685,7 +5682,7 @@
                 <w:b w:val="0"/>
                 <w:sz w:val="24"/>
               </w:rPr>
-              <w:t>Lectura de distancia</w:t>
+              <w:t xml:space="preserve">Observación de la corrida</w:t>
             </w:r>
           </w:p>
         </w:tc>
@@ -5711,7 +5708,7 @@
                 <w:b w:val="0"/>
                 <w:sz w:val="24"/>
               </w:rPr>
-              <w:t>Tiempo relativo, lectura del sensor en cm, validez y causa de fallo si corresponde.</w:t>
+              <w:t xml:space="preserve">Primera detención identificada, contacto con el obstáculo y causa de fallo o de dato ausente, si corresponde.</w:t>
             </w:r>
           </w:p>
         </w:tc>
@@ -5825,7 +5822,7 @@
                 <w:b w:val="0"/>
                 <w:sz w:val="24"/>
               </w:rPr>
-              <w:t>Orden, configuración PWM, evento de parada, contacto, éxito o fracaso y observaciones.</w:t>
+              <w:t xml:space="preserve">Modo utilizado, carga de las baterías, éxito o fracaso y observaciones.</w:t>
             </w:r>
           </w:p>
         </w:tc>
@@ -5931,19 +5928,7 @@
             </a:graphic>
           </wp:inline>
         </w:drawing>
-      </w:r>
-      <w:r>
-        <w:rPr>
-          <w:rFonts w:ascii="Arial" w:hAnsi="Arial" w:eastAsia="Arial" w:cs="Arial"/>
-          <w:sz w:val="24"/>
-        </w:rPr>
         <w:t xml:space="preserve">  </w:t>
-      </w:r>
-      <w:r>
-        <w:rPr>
-          <w:rFonts w:ascii="Arial" w:hAnsi="Arial" w:eastAsia="Arial" w:cs="Arial"/>
-          <w:sz w:val="24"/>
-        </w:rPr>
         <w:drawing>
           <wp:inline xmlns:a="http://schemas.openxmlformats.org/drawingml/2006/main" xmlns:pic="http://schemas.openxmlformats.org/drawingml/2006/picture">
             <wp:extent cx="2412000" cy="4288000"/>
@@ -6064,19 +6049,7 @@
             </a:graphic>
           </wp:inline>
         </w:drawing>
-      </w:r>
-      <w:r>
-        <w:rPr>
-          <w:rFonts w:ascii="Arial" w:hAnsi="Arial" w:eastAsia="Arial" w:cs="Arial"/>
-          <w:sz w:val="24"/>
-        </w:rPr>
         <w:t xml:space="preserve">  </w:t>
-      </w:r>
-      <w:r>
-        <w:rPr>
-          <w:rFonts w:ascii="Arial" w:hAnsi="Arial" w:eastAsia="Arial" w:cs="Arial"/>
-          <w:sz w:val="24"/>
-        </w:rPr>
         <w:drawing>
           <wp:inline xmlns:a="http://schemas.openxmlformats.org/drawingml/2006/main" xmlns:pic="http://schemas.openxmlformats.org/drawingml/2006/picture">
             <wp:extent cx="2412000" cy="4288000"/>
@@ -6323,7 +6296,7 @@
           <w:rFonts w:ascii="Arial" w:hAnsi="Arial" w:eastAsia="Arial" w:cs="Arial"/>
           <w:sz w:val="24"/>
         </w:rPr>
-        <w:t>Con el prototipo ensamblado, el grupo comprobó el movimiento mediante la aplicación oficial de ACEBOTT por Wi-Fi. Las pruebas autónomas y su evaluación experimental están pendientes.</w:t>
+        <w:t>Con el prototipo ensamblado, el grupo comprobó el movimiento mediante la aplicación oficial de ACEBOTT por Wi-Fi. Los ensayos del modo de evasión y su evaluación experimental están pendientes.</w:t>
       </w:r>
     </w:p>
     <w:p>
@@ -9832,7 +9805,7 @@
           <w:rFonts w:ascii="Arial" w:hAnsi="Arial" w:eastAsia="Arial" w:cs="Arial"/>
           <w:sz w:val="24"/>
         </w:rPr>
-        <w:t>La biblioteca servo.py del paquete oficial Python V1 configura PWM a 50 Hz y convierte el ángulo solicitado en duración de pulso; se utiliza como referencia de implementación del fabricante (ACEBOTT, s. f.-k). La ficha QB054 expresa el par como KG/cm, una unidad ambigua que requiere aclaración antes de utilizar ese valor en el diseño (ACEBOTT, s. f.-h).</w:t>
+        <w:t>El control por PWM relaciona la duración del pulso con la posición angular solicitada. Su implementación se explicará a partir de las funciones utilizadas por el programa de control (ACEBOTT, s. f.-k). La ficha QB054 expresa el par como KG/cm, una unidad ambigua que requiere aclaración antes de utilizar ese valor en el diseño (ACEBOTT, s. f.-h).</w:t>
       </w:r>
     </w:p>
     <w:p>
@@ -9855,6 +9828,62 @@
     </w:p>
     <w:p>
       <w:pPr>
+        <w:pStyle w:val="Heading2"/>
+        <w:keepNext/>
+        <w:pageBreakBefore/>
+      </w:pPr>
+      <w:r>
+        <w:rPr>
+          <w:rFonts w:ascii="Arial" w:hAnsi="Arial" w:eastAsia="Arial" w:cs="Arial"/>
+          <w:sz w:val="28"/>
+          <w:b w:val="1"/>
+        </w:rPr>
+        <w:t>D.4 Tracción y alimentación</w:t>
+      </w:r>
+    </w:p>
+    <w:p>
+      <w:pPr>
+        <w:pStyle w:val="Heading3"/>
+        <w:keepNext/>
+        <w:pageBreakBefore w:val="0"/>
+      </w:pPr>
+      <w:r>
+        <w:rPr>
+          <w:rFonts w:ascii="Arial" w:hAnsi="Arial" w:eastAsia="Arial" w:cs="Arial"/>
+          <w:sz w:val="28"/>
+          <w:b w:val="1"/>
+        </w:rPr>
+        <w:t>Motores TT y ruedas Mecanum</w:t>
+      </w:r>
+    </w:p>
+    <w:p>
+      <w:pPr>
+        <w:keepNext w:val="0"/>
+        <w:spacing w:after="120"/>
+      </w:pPr>
+      <w:r>
+        <w:rPr>
+          <w:rFonts w:ascii="Arial" w:hAnsi="Arial" w:eastAsia="Arial" w:cs="Arial"/>
+          <w:sz w:val="24"/>
+        </w:rPr>
+        <w:t>Los motores producen el desplazamiento del vehículo. La Product List y el paso 3 del manual V2 incluyen cuatro TT DC Geared Motor y cuatro Motor Bracket. El paso 11 especifica cuatro ruedas Mecanum de 60 mm con cuatro acopladores e indica su orientación de montaje (ACEBOTT, s. f.-k).</w:t>
+      </w:r>
+    </w:p>
+    <w:p>
+      <w:pPr>
+        <w:keepNext w:val="0"/>
+        <w:spacing w:after="120"/>
+      </w:pPr>
+      <w:r>
+        <w:rPr>
+          <w:rFonts w:ascii="Arial" w:hAnsi="Arial" w:eastAsia="Arial" w:cs="Arial"/>
+          <w:sz w:val="24"/>
+        </w:rPr>
+        <w:t>Las figuras 3, 4, 6 y 7 muestran los motores con reductora y las ruedas en distintas etapas. La relación de reducción, la velocidad nominal, la corriente de bloqueo y la tensión individual de los motores se completarán al identificar sus especificaciones.</w:t>
+      </w:r>
+    </w:p>
+    <w:p>
+      <w:pPr>
         <w:keepNext w:val="0"/>
         <w:spacing w:after="140"/>
         <w:jc w:val="left"/>
@@ -9873,9 +9902,9 @@
     </w:p>
     <w:p>
       <w:pPr>
-        <w:pStyle w:val="Heading2"/>
+        <w:pStyle w:val="Heading3"/>
         <w:keepNext/>
-        <w:pageBreakBefore/>
+        <w:pageBreakBefore w:val="0"/>
       </w:pPr>
       <w:r>
         <w:rPr>
@@ -9883,22 +9912,7 @@
           <w:sz w:val="28"/>
           <w:b w:val="1"/>
         </w:rPr>
-        <w:t>D.4 Tracción y alimentación</w:t>
-      </w:r>
-    </w:p>
-    <w:p>
-      <w:pPr>
-        <w:pStyle w:val="Heading3"/>
-        <w:keepNext/>
-        <w:pageBreakBefore w:val="0"/>
-      </w:pPr>
-      <w:r>
-        <w:rPr>
-          <w:rFonts w:ascii="Arial" w:hAnsi="Arial" w:eastAsia="Arial" w:cs="Arial"/>
-          <w:sz w:val="28"/>
-          <w:b w:val="1"/>
-        </w:rPr>
-        <w:t>Motores TT y ruedas Mecanum</w:t>
+        <w:t>Portabaterías y celdas requeridas</w:t>
       </w:r>
     </w:p>
     <w:p>
@@ -9911,7 +9925,7 @@
           <w:rFonts w:ascii="Arial" w:hAnsi="Arial" w:eastAsia="Arial" w:cs="Arial"/>
           <w:sz w:val="24"/>
         </w:rPr>
-        <w:t>Los motores producen el desplazamiento del vehículo. La Product List y el paso 3 del manual V2 incluyen cuatro TT DC Geared Motor y cuatro Motor Bracket. El paso 11 especifica cuatro ruedas Mecanum de 60 mm con cuatro acopladores e indica su orientación de montaje (ACEBOTT, s. f.-k).</w:t>
+        <w:t>El inventario incluye un 18650 Battery Holder. El manual V2 requiere dos baterías 18650 button-top de provisión separada y especifica celdas de ion de litio protegidas de 3,7 V con circuito PCM. El paso 9 distingue el portabaterías de las dos celdas suministradas por el usuario (ACEBOTT, s. f.-k).</w:t>
       </w:r>
     </w:p>
     <w:p>
@@ -9924,7 +9938,7 @@
           <w:rFonts w:ascii="Arial" w:hAnsi="Arial" w:eastAsia="Arial" w:cs="Arial"/>
           <w:sz w:val="24"/>
         </w:rPr>
-        <w:t>Las figuras 3, 4, 6 y 7 muestran los motores con reductora y las ruedas en distintas etapas. La relación de reducción, la velocidad nominal, la corriente de bloqueo y la tensión individual de los motores se completarán al identificar sus especificaciones.</w:t>
+        <w:t>La figura 8 muestra la colocación de las celdas en el portabaterías. Para los ensayos se registrarán su capacidad, protección, tensión, estado y condiciones de carga, junto con el esquema de alimentación.</w:t>
       </w:r>
     </w:p>
     <w:p>
@@ -9947,65 +9961,6 @@
     </w:p>
     <w:p>
       <w:pPr>
-        <w:pStyle w:val="Heading3"/>
-        <w:keepNext/>
-        <w:pageBreakBefore w:val="0"/>
-      </w:pPr>
-      <w:r>
-        <w:rPr>
-          <w:rFonts w:ascii="Arial" w:hAnsi="Arial" w:eastAsia="Arial" w:cs="Arial"/>
-          <w:sz w:val="28"/>
-          <w:b w:val="1"/>
-        </w:rPr>
-        <w:t>Portabaterías y celdas requeridas</w:t>
-      </w:r>
-    </w:p>
-    <w:p>
-      <w:pPr>
-        <w:keepNext w:val="0"/>
-        <w:spacing w:after="120"/>
-      </w:pPr>
-      <w:r>
-        <w:rPr>
-          <w:rFonts w:ascii="Arial" w:hAnsi="Arial" w:eastAsia="Arial" w:cs="Arial"/>
-          <w:sz w:val="24"/>
-        </w:rPr>
-        <w:t>El inventario incluye un 18650 Battery Holder. El manual V2 requiere dos baterías 18650 button-top de provisión separada y especifica celdas de ion de litio protegidas de 3,7 V con circuito PCM. El paso 9 distingue el portabaterías de las dos celdas suministradas por el usuario (ACEBOTT, s. f.-k).</w:t>
-      </w:r>
-    </w:p>
-    <w:p>
-      <w:pPr>
-        <w:keepNext w:val="0"/>
-        <w:spacing w:after="120"/>
-      </w:pPr>
-      <w:r>
-        <w:rPr>
-          <w:rFonts w:ascii="Arial" w:hAnsi="Arial" w:eastAsia="Arial" w:cs="Arial"/>
-          <w:sz w:val="24"/>
-        </w:rPr>
-        <w:t>La figura 8 muestra la colocación de las celdas en el portabaterías. Para los ensayos se registrarán su capacidad, protección, tensión, estado y condiciones de carga, junto con el esquema de alimentación.</w:t>
-      </w:r>
-    </w:p>
-    <w:p>
-      <w:pPr>
-        <w:keepNext w:val="0"/>
-        <w:spacing w:after="140"/>
-        <w:jc w:val="left"/>
-      </w:pPr>
-      <w:hyperlink r:id="rId31">
-        <w:r>
-          <w:rPr>
-            <w:rFonts w:ascii="Arial" w:hAnsi="Arial" w:eastAsia="Arial" w:cs="Arial"/>
-            <w:color w:val="1F4E79"/>
-            <w:u w:val="single"/>
-            <w:sz w:val="24"/>
-          </w:rPr>
-          <w:t>https://acebott.com/tutorial/</w:t>
-        </w:r>
-      </w:hyperlink>
-    </w:p>
-    <w:p>
-      <w:pPr>
         <w:pStyle w:val="Heading2"/>
         <w:keepNext/>
         <w:pageBreakBefore/>
@@ -10057,7 +10012,7 @@
           <w:rFonts w:ascii="Arial" w:hAnsi="Arial" w:eastAsia="Arial" w:cs="Arial"/>
           <w:sz w:val="24"/>
         </w:rPr>
-        <w:t>El sensor de seguimiento de línea se instaló en la placa inferior durante el armado. Su ficha permite estudiar una posible aplicación del módulo en futuras actividades.</w:t>
+        <w:t xml:space="preserve">El sensor de seguimiento de línea se instaló en la placa inferior durante el armado. El programa de control lo utiliza en el modo de seguimiento de línea, que no forma parte de los ensayos de este trabajo.</w:t>
       </w:r>
     </w:p>
     <w:p>
@@ -10116,7 +10071,7 @@
           <w:rFonts w:ascii="Arial" w:hAnsi="Arial" w:eastAsia="Arial" w:cs="Arial"/>
           <w:sz w:val="24"/>
         </w:rPr>
-        <w:t>El mando transmite códigos y el receptor entrega la señal que interpreta el programa. Este sistema ofrece una modalidad de control por infrarrojos; en el montaje del grupo se utilizó el control manual por Wi-Fi.</w:t>
+        <w:t>El mando transmite códigos y el receptor entrega la señal que interpreta un programa. El paquete del QD001 incluye ejemplos específicos de control infrarrojo. En el proyecto final consultado no se identificó lógica de recepción IR; el control comprobado por el grupo fue mediante la aplicación por Wi-Fi.</w:t>
       </w:r>
     </w:p>
     <w:p>
@@ -10435,7 +10390,7 @@
           <w:b w:val="0"/>
           <w:sz w:val="24"/>
         </w:rPr>
-        <w:t>Se conservarán los archivos de análisis y las tablas y gráficos producidos a partir de los datos originales. El registro deberá permitir relacionar cada resultado con su condición, número de observaciones, unidades, fórmula y regla de exclusión. Cualquier corrección de calibración deberá identificar los datos utilizados para ajustarla y para comprobarla.</w:t>
+        <w:t>Se conservarán las planillas de cálculo y las tablas y gráficos producidos a partir de los datos originales. El registro deberá permitir relacionar cada resultado con su condición, número de observaciones, unidades, fórmula y regla de exclusión. Cualquier corrección de calibración deberá identificar los datos utilizados para ajustarla y para comprobarla.</w:t>
       </w:r>
     </w:p>
     <w:p>

</xml_diff>